<commit_message>
docs: add spacing for clarity in submission evidence document
</commit_message>
<xml_diff>
--- a/docs/submission_evidence.docx
+++ b/docs/submission_evidence.docx
@@ -5,6 +5,12 @@
     <w:bookmarkStart w:id="0" w:name="X7e557e32b8ab34858f44e5225686f8c37d1b803" w:displacedByCustomXml="next"/>
     <w:sdt>
       <w:sdtPr>
+        <w:rPr>
+          <w:rFonts w:asciiTheme="minorHAnsi" w:eastAsiaTheme="minorEastAsia" w:hAnsiTheme="minorHAnsi" w:cstheme="minorBidi"/>
+          <w:color w:val="auto"/>
+          <w:sz w:val="24"/>
+          <w:szCs w:val="24"/>
+        </w:rPr>
         <w:id w:val="1678224184"/>
         <w:docPartObj>
           <w:docPartGallery w:val="Table of Contents"/>
@@ -13,13 +19,9 @@
       </w:sdtPr>
       <w:sdtEndPr>
         <w:rPr>
-          <w:rFonts w:asciiTheme="minorHAnsi" w:eastAsiaTheme="minorEastAsia" w:hAnsiTheme="minorHAnsi" w:cstheme="minorBidi"/>
           <w:b/>
           <w:bCs/>
           <w:noProof/>
-          <w:color w:val="auto"/>
-          <w:sz w:val="24"/>
-          <w:szCs w:val="24"/>
         </w:rPr>
       </w:sdtEndPr>
       <w:sdtContent>
@@ -328,21 +330,7 @@
                 <w:rStyle w:val="Hyperlink"/>
                 <w:noProof/>
               </w:rPr>
-              <w:t xml:space="preserve">What </w:t>
-            </w:r>
-            <w:r>
-              <w:rPr>
-                <w:rStyle w:val="Hyperlink"/>
-                <w:noProof/>
-              </w:rPr>
-              <w:t>t</w:t>
-            </w:r>
-            <w:r>
-              <w:rPr>
-                <w:rStyle w:val="Hyperlink"/>
-                <w:noProof/>
-              </w:rPr>
-              <w:t>his does</w:t>
+              <w:t>What this does</w:t>
             </w:r>
             <w:r>
               <w:rPr>
@@ -2862,12 +2850,12 @@
       <w:pPr>
         <w:pStyle w:val="Heading2"/>
       </w:pPr>
-      <w:bookmarkStart w:id="2" w:name="submission-checklist"/>
-      <w:bookmarkStart w:id="3" w:name="_Toc239004792"/>
+      <w:bookmarkStart w:id="2" w:name="_Toc239004792"/>
+      <w:bookmarkStart w:id="3" w:name="submission-checklist"/>
       <w:r>
         <w:t>Submission Checklist</w:t>
       </w:r>
-      <w:bookmarkEnd w:id="3"/>
+      <w:bookmarkEnd w:id="2"/>
     </w:p>
     <w:tbl>
       <w:tblPr>
@@ -3285,24 +3273,24 @@
       <w:pPr>
         <w:pStyle w:val="Heading2"/>
       </w:pPr>
-      <w:bookmarkStart w:id="4" w:name="week-1-m2-data-engineering"/>
-      <w:bookmarkStart w:id="5" w:name="_Toc239004793"/>
-      <w:bookmarkEnd w:id="2"/>
+      <w:bookmarkStart w:id="4" w:name="_Toc239004793"/>
+      <w:bookmarkStart w:id="5" w:name="week-1-m2-data-engineering"/>
+      <w:bookmarkEnd w:id="3"/>
       <w:r>
         <w:t>Week 1 / M2 — Data Engineering</w:t>
       </w:r>
-      <w:bookmarkEnd w:id="5"/>
+      <w:bookmarkEnd w:id="4"/>
     </w:p>
     <w:p>
       <w:pPr>
         <w:pStyle w:val="Heading3"/>
       </w:pPr>
-      <w:bookmarkStart w:id="6" w:name="command-to-reproduce"/>
-      <w:bookmarkStart w:id="7" w:name="_Toc239004794"/>
+      <w:bookmarkStart w:id="6" w:name="_Toc239004794"/>
+      <w:bookmarkStart w:id="7" w:name="command-to-reproduce"/>
       <w:r>
         <w:t>Command to reproduce</w:t>
       </w:r>
-      <w:bookmarkEnd w:id="7"/>
+      <w:bookmarkEnd w:id="6"/>
     </w:p>
     <w:p>
       <w:pPr>
@@ -3319,14 +3307,14 @@
       <w:pPr>
         <w:pStyle w:val="Heading3"/>
       </w:pPr>
-      <w:bookmarkStart w:id="8" w:name="what-this-does"/>
-      <w:bookmarkStart w:id="9" w:name="_Toc239004795"/>
-      <w:bookmarkEnd w:id="6"/>
+      <w:bookmarkStart w:id="8" w:name="_Toc239004795"/>
+      <w:bookmarkStart w:id="9" w:name="what-this-does"/>
+      <w:bookmarkEnd w:id="7"/>
       <w:r>
         <w:lastRenderedPageBreak/>
         <w:t>What this does</w:t>
       </w:r>
-      <w:bookmarkEnd w:id="9"/>
+      <w:bookmarkEnd w:id="8"/>
     </w:p>
     <w:p>
       <w:pPr>
@@ -3427,9 +3415,9 @@
       <w:pPr>
         <w:pStyle w:val="Heading3"/>
       </w:pPr>
-      <w:bookmarkStart w:id="10" w:name="X2abdd1b6bcee7e048db9f8abfa6e78550750911"/>
-      <w:bookmarkStart w:id="11" w:name="_Toc239004796"/>
-      <w:bookmarkEnd w:id="8"/>
+      <w:bookmarkStart w:id="10" w:name="_Toc239004796"/>
+      <w:bookmarkStart w:id="11" w:name="X2abdd1b6bcee7e048db9f8abfa6e78550750911"/>
+      <w:bookmarkEnd w:id="9"/>
       <w:r>
         <w:t xml:space="preserve">Validation results — </w:t>
       </w:r>
@@ -3439,7 +3427,7 @@
         </w:rPr>
         <w:t>reports/validation/validation_report.md</w:t>
       </w:r>
-      <w:bookmarkEnd w:id="11"/>
+      <w:bookmarkEnd w:id="10"/>
     </w:p>
     <w:tbl>
       <w:tblPr>
@@ -4271,9 +4259,9 @@
       <w:pPr>
         <w:pStyle w:val="Heading3"/>
       </w:pPr>
-      <w:bookmarkStart w:id="12" w:name="X7f7d3f8a14a5ad254105bc8e0d2211897911d2f"/>
-      <w:bookmarkStart w:id="13" w:name="_Toc239004797"/>
-      <w:bookmarkEnd w:id="10"/>
+      <w:bookmarkStart w:id="12" w:name="_Toc239004797"/>
+      <w:bookmarkStart w:id="13" w:name="X7f7d3f8a14a5ad254105bc8e0d2211897911d2f"/>
+      <w:bookmarkEnd w:id="11"/>
       <w:r>
         <w:lastRenderedPageBreak/>
         <w:t xml:space="preserve">Feature pipeline — </w:t>
@@ -4284,7 +4272,7 @@
         </w:rPr>
         <w:t>models/feature_pipeline/feature_spec.json</w:t>
       </w:r>
-      <w:bookmarkEnd w:id="13"/>
+      <w:bookmarkEnd w:id="12"/>
     </w:p>
     <w:tbl>
       <w:tblPr>
@@ -4809,9 +4797,9 @@
       <w:pPr>
         <w:pStyle w:val="Heading3"/>
       </w:pPr>
-      <w:bookmarkStart w:id="14" w:name="X8204f7a5726a086fad00cb5921d3c517ce85dd8"/>
-      <w:bookmarkStart w:id="15" w:name="_Toc239004798"/>
-      <w:bookmarkEnd w:id="12"/>
+      <w:bookmarkStart w:id="14" w:name="_Toc239004798"/>
+      <w:bookmarkStart w:id="15" w:name="X8204f7a5726a086fad00cb5921d3c517ce85dd8"/>
+      <w:bookmarkEnd w:id="13"/>
       <w:r>
         <w:t xml:space="preserve">Dataset split — </w:t>
       </w:r>
@@ -4821,7 +4809,7 @@
         </w:rPr>
         <w:t>reports/features/feature_summary.json</w:t>
       </w:r>
-      <w:bookmarkEnd w:id="15"/>
+      <w:bookmarkEnd w:id="14"/>
     </w:p>
     <w:tbl>
       <w:tblPr>
@@ -5060,13 +5048,13 @@
       <w:pPr>
         <w:pStyle w:val="Heading3"/>
       </w:pPr>
-      <w:bookmarkStart w:id="16" w:name="key-design-decisions"/>
-      <w:bookmarkStart w:id="17" w:name="_Toc239004799"/>
-      <w:bookmarkEnd w:id="14"/>
+      <w:bookmarkStart w:id="16" w:name="_Toc239004799"/>
+      <w:bookmarkStart w:id="17" w:name="key-design-decisions"/>
+      <w:bookmarkEnd w:id="15"/>
       <w:r>
         <w:t>Key design decisions</w:t>
       </w:r>
-      <w:bookmarkEnd w:id="17"/>
+      <w:bookmarkEnd w:id="16"/>
     </w:p>
     <w:p>
       <w:pPr>
@@ -5210,25 +5198,25 @@
       <w:pPr>
         <w:pStyle w:val="Heading2"/>
       </w:pPr>
-      <w:bookmarkStart w:id="18" w:name="week-2-m3-experimentation"/>
-      <w:bookmarkStart w:id="19" w:name="_Toc239004800"/>
-      <w:bookmarkEnd w:id="4"/>
-      <w:bookmarkEnd w:id="16"/>
+      <w:bookmarkStart w:id="18" w:name="_Toc239004800"/>
+      <w:bookmarkStart w:id="19" w:name="week-2-m3-experimentation"/>
+      <w:bookmarkEnd w:id="5"/>
+      <w:bookmarkEnd w:id="17"/>
       <w:r>
         <w:t>Week 2 / M3 — Experimentation</w:t>
       </w:r>
-      <w:bookmarkEnd w:id="19"/>
+      <w:bookmarkEnd w:id="18"/>
     </w:p>
     <w:p>
       <w:pPr>
         <w:pStyle w:val="Heading3"/>
       </w:pPr>
-      <w:bookmarkStart w:id="20" w:name="command-to-reproduce-1"/>
-      <w:bookmarkStart w:id="21" w:name="_Toc239004801"/>
+      <w:bookmarkStart w:id="20" w:name="_Toc239004801"/>
+      <w:bookmarkStart w:id="21" w:name="command-to-reproduce-1"/>
       <w:r>
         <w:t>Command to reproduce</w:t>
       </w:r>
-      <w:bookmarkEnd w:id="21"/>
+      <w:bookmarkEnd w:id="20"/>
     </w:p>
     <w:p>
       <w:pPr>
@@ -5289,10 +5277,13 @@
     <w:p>
       <w:pPr>
         <w:pStyle w:val="Heading3"/>
+        <w:rPr>
+          <w:rStyle w:val="VerbatimChar"/>
+        </w:rPr>
       </w:pPr>
-      <w:bookmarkStart w:id="22" w:name="X52ebbc7cda0f5c12868e63f991070ae2bbaf4f2"/>
-      <w:bookmarkStart w:id="23" w:name="_Toc239004802"/>
-      <w:bookmarkEnd w:id="20"/>
+      <w:bookmarkStart w:id="22" w:name="_Toc239004802"/>
+      <w:bookmarkStart w:id="23" w:name="X52ebbc7cda0f5c12868e63f991070ae2bbaf4f2"/>
+      <w:bookmarkEnd w:id="21"/>
       <w:r>
         <w:t xml:space="preserve">Model comparison — </w:t>
       </w:r>
@@ -5302,7 +5293,139 @@
         </w:rPr>
         <w:t>reports/model_comparison.md</w:t>
       </w:r>
-      <w:bookmarkEnd w:id="23"/>
+      <w:bookmarkEnd w:id="22"/>
+    </w:p>
+    <w:p>
+      <w:pPr>
+        <w:pStyle w:val="BodyText"/>
+      </w:pPr>
+      <w:r>
+        <w:drawing>
+          <wp:inline distT="0" distB="0" distL="0" distR="0" wp14:anchorId="3A830CB2" wp14:editId="6A1687EC">
+            <wp:extent cx="5943600" cy="2049145"/>
+            <wp:effectExtent l="0" t="0" r="0" b="0"/>
+            <wp:docPr id="1106595905" name="Picture 1"/>
+            <wp:cNvGraphicFramePr>
+              <a:graphicFrameLocks xmlns:a="http://schemas.openxmlformats.org/drawingml/2006/main" noChangeAspect="1"/>
+            </wp:cNvGraphicFramePr>
+            <a:graphic xmlns:a="http://schemas.openxmlformats.org/drawingml/2006/main">
+              <a:graphicData uri="http://schemas.openxmlformats.org/drawingml/2006/picture">
+                <pic:pic xmlns:pic="http://schemas.openxmlformats.org/drawingml/2006/picture">
+                  <pic:nvPicPr>
+                    <pic:cNvPr id="1106595905" name=""/>
+                    <pic:cNvPicPr/>
+                  </pic:nvPicPr>
+                  <pic:blipFill>
+                    <a:blip r:embed="rId6"/>
+                    <a:stretch>
+                      <a:fillRect/>
+                    </a:stretch>
+                  </pic:blipFill>
+                  <pic:spPr>
+                    <a:xfrm>
+                      <a:off x="0" y="0"/>
+                      <a:ext cx="5943600" cy="2049145"/>
+                    </a:xfrm>
+                    <a:prstGeom prst="rect">
+                      <a:avLst/>
+                    </a:prstGeom>
+                  </pic:spPr>
+                </pic:pic>
+              </a:graphicData>
+            </a:graphic>
+          </wp:inline>
+        </w:drawing>
+      </w:r>
+    </w:p>
+    <w:p>
+      <w:pPr>
+        <w:pStyle w:val="BodyText"/>
+      </w:pPr>
+      <w:r>
+        <w:lastRenderedPageBreak/>
+        <w:drawing>
+          <wp:inline distT="0" distB="0" distL="0" distR="0" wp14:anchorId="4D1E3F0D" wp14:editId="31CB7E91">
+            <wp:extent cx="5943600" cy="2719705"/>
+            <wp:effectExtent l="0" t="0" r="0" b="0"/>
+            <wp:docPr id="901571801" name="Picture 1"/>
+            <wp:cNvGraphicFramePr>
+              <a:graphicFrameLocks xmlns:a="http://schemas.openxmlformats.org/drawingml/2006/main" noChangeAspect="1"/>
+            </wp:cNvGraphicFramePr>
+            <a:graphic xmlns:a="http://schemas.openxmlformats.org/drawingml/2006/main">
+              <a:graphicData uri="http://schemas.openxmlformats.org/drawingml/2006/picture">
+                <pic:pic xmlns:pic="http://schemas.openxmlformats.org/drawingml/2006/picture">
+                  <pic:nvPicPr>
+                    <pic:cNvPr id="901571801" name=""/>
+                    <pic:cNvPicPr/>
+                  </pic:nvPicPr>
+                  <pic:blipFill>
+                    <a:blip r:embed="rId7"/>
+                    <a:stretch>
+                      <a:fillRect/>
+                    </a:stretch>
+                  </pic:blipFill>
+                  <pic:spPr>
+                    <a:xfrm>
+                      <a:off x="0" y="0"/>
+                      <a:ext cx="5943600" cy="2719705"/>
+                    </a:xfrm>
+                    <a:prstGeom prst="rect">
+                      <a:avLst/>
+                    </a:prstGeom>
+                  </pic:spPr>
+                </pic:pic>
+              </a:graphicData>
+            </a:graphic>
+          </wp:inline>
+        </w:drawing>
+      </w:r>
+    </w:p>
+    <w:p>
+      <w:pPr>
+        <w:pStyle w:val="BodyText"/>
+      </w:pPr>
+    </w:p>
+    <w:p>
+      <w:pPr>
+        <w:pStyle w:val="BodyText"/>
+      </w:pPr>
+      <w:r>
+        <w:drawing>
+          <wp:inline distT="0" distB="0" distL="0" distR="0" wp14:anchorId="0258372E" wp14:editId="47FBCC71">
+            <wp:extent cx="5943600" cy="2913380"/>
+            <wp:effectExtent l="0" t="0" r="0" b="0"/>
+            <wp:docPr id="135287" name="Picture 1"/>
+            <wp:cNvGraphicFramePr>
+              <a:graphicFrameLocks xmlns:a="http://schemas.openxmlformats.org/drawingml/2006/main" noChangeAspect="1"/>
+            </wp:cNvGraphicFramePr>
+            <a:graphic xmlns:a="http://schemas.openxmlformats.org/drawingml/2006/main">
+              <a:graphicData uri="http://schemas.openxmlformats.org/drawingml/2006/picture">
+                <pic:pic xmlns:pic="http://schemas.openxmlformats.org/drawingml/2006/picture">
+                  <pic:nvPicPr>
+                    <pic:cNvPr id="135287" name=""/>
+                    <pic:cNvPicPr/>
+                  </pic:nvPicPr>
+                  <pic:blipFill>
+                    <a:blip r:embed="rId8"/>
+                    <a:stretch>
+                      <a:fillRect/>
+                    </a:stretch>
+                  </pic:blipFill>
+                  <pic:spPr>
+                    <a:xfrm>
+                      <a:off x="0" y="0"/>
+                      <a:ext cx="5943600" cy="2913380"/>
+                    </a:xfrm>
+                    <a:prstGeom prst="rect">
+                      <a:avLst/>
+                    </a:prstGeom>
+                  </pic:spPr>
+                </pic:pic>
+              </a:graphicData>
+            </a:graphic>
+          </wp:inline>
+        </w:drawing>
+      </w:r>
     </w:p>
     <w:tbl>
       <w:tblPr>
@@ -5717,7 +5840,11 @@
               <w:pStyle w:val="Compact"/>
             </w:pPr>
             <w:r>
-              <w:t>baseline (median)</w:t>
+              <w:t xml:space="preserve">baseline </w:t>
+            </w:r>
+            <w:r>
+              <w:lastRenderedPageBreak/>
+              <w:t>(median)</w:t>
             </w:r>
           </w:p>
         </w:tc>
@@ -5730,6 +5857,7 @@
               <w:pStyle w:val="Compact"/>
             </w:pPr>
             <w:r>
+              <w:lastRenderedPageBreak/>
               <w:t>12.030</w:t>
             </w:r>
           </w:p>
@@ -5805,9 +5933,9 @@
       <w:pPr>
         <w:pStyle w:val="Heading3"/>
       </w:pPr>
-      <w:bookmarkStart w:id="24" w:name="best-model-reportsmetrics.json"/>
-      <w:bookmarkStart w:id="25" w:name="_Toc239004803"/>
-      <w:bookmarkEnd w:id="22"/>
+      <w:bookmarkStart w:id="24" w:name="_Toc239004803"/>
+      <w:bookmarkStart w:id="25" w:name="best-model-reportsmetrics.json"/>
+      <w:bookmarkEnd w:id="23"/>
       <w:r>
         <w:t xml:space="preserve">Best model — </w:t>
       </w:r>
@@ -5817,7 +5945,7 @@
         </w:rPr>
         <w:t>reports/metrics.json</w:t>
       </w:r>
-      <w:bookmarkEnd w:id="25"/>
+      <w:bookmarkEnd w:id="24"/>
     </w:p>
     <w:tbl>
       <w:tblPr>
@@ -6090,14 +6218,13 @@
       <w:pPr>
         <w:pStyle w:val="Heading3"/>
       </w:pPr>
-      <w:bookmarkStart w:id="26" w:name="mlflow-tracking"/>
-      <w:bookmarkStart w:id="27" w:name="_Toc239004804"/>
-      <w:bookmarkEnd w:id="24"/>
-      <w:r>
-        <w:lastRenderedPageBreak/>
+      <w:bookmarkStart w:id="26" w:name="_Toc239004804"/>
+      <w:bookmarkStart w:id="27" w:name="mlflow-tracking"/>
+      <w:bookmarkEnd w:id="25"/>
+      <w:r>
         <w:t>MLflow tracking</w:t>
       </w:r>
-      <w:bookmarkEnd w:id="27"/>
+      <w:bookmarkEnd w:id="26"/>
     </w:p>
     <w:p>
       <w:pPr>
@@ -6181,13 +6308,13 @@
       <w:pPr>
         <w:pStyle w:val="Heading3"/>
       </w:pPr>
-      <w:bookmarkStart w:id="28" w:name="reproducing-the-selected-run"/>
-      <w:bookmarkStart w:id="29" w:name="_Toc239004805"/>
-      <w:bookmarkEnd w:id="26"/>
+      <w:bookmarkStart w:id="28" w:name="_Toc239004805"/>
+      <w:bookmarkStart w:id="29" w:name="reproducing-the-selected-run"/>
+      <w:bookmarkEnd w:id="27"/>
       <w:r>
         <w:t>Reproducing the selected run</w:t>
       </w:r>
-      <w:bookmarkEnd w:id="29"/>
+      <w:bookmarkEnd w:id="28"/>
     </w:p>
     <w:p>
       <w:pPr>
@@ -6258,13 +6385,13 @@
       <w:pPr>
         <w:pStyle w:val="Heading3"/>
       </w:pPr>
-      <w:bookmarkStart w:id="30" w:name="key-design-decisions-1"/>
-      <w:bookmarkStart w:id="31" w:name="_Toc239004806"/>
-      <w:bookmarkEnd w:id="28"/>
+      <w:bookmarkStart w:id="30" w:name="_Toc239004806"/>
+      <w:bookmarkStart w:id="31" w:name="key-design-decisions-1"/>
+      <w:bookmarkEnd w:id="29"/>
       <w:r>
         <w:t>Key design decisions</w:t>
       </w:r>
-      <w:bookmarkEnd w:id="31"/>
+      <w:bookmarkEnd w:id="30"/>
     </w:p>
     <w:p>
       <w:pPr>
@@ -6401,25 +6528,26 @@
       <w:pPr>
         <w:pStyle w:val="Heading2"/>
       </w:pPr>
-      <w:bookmarkStart w:id="32" w:name="week-3-m4-packaging-and-serving"/>
-      <w:bookmarkStart w:id="33" w:name="_Toc239004807"/>
-      <w:bookmarkEnd w:id="18"/>
-      <w:bookmarkEnd w:id="30"/>
-      <w:r>
+      <w:bookmarkStart w:id="32" w:name="_Toc239004807"/>
+      <w:bookmarkStart w:id="33" w:name="week-3-m4-packaging-and-serving"/>
+      <w:bookmarkEnd w:id="19"/>
+      <w:bookmarkEnd w:id="31"/>
+      <w:r>
+        <w:lastRenderedPageBreak/>
         <w:t>Week 3 / M4 — Packaging and Serving</w:t>
       </w:r>
-      <w:bookmarkEnd w:id="33"/>
+      <w:bookmarkEnd w:id="32"/>
     </w:p>
     <w:p>
       <w:pPr>
         <w:pStyle w:val="Heading3"/>
       </w:pPr>
-      <w:bookmarkStart w:id="34" w:name="commands"/>
-      <w:bookmarkStart w:id="35" w:name="_Toc239004808"/>
+      <w:bookmarkStart w:id="34" w:name="_Toc239004808"/>
+      <w:bookmarkStart w:id="35" w:name="commands"/>
       <w:r>
         <w:t>Commands</w:t>
       </w:r>
-      <w:bookmarkEnd w:id="35"/>
+      <w:bookmarkEnd w:id="34"/>
     </w:p>
     <w:p>
       <w:pPr>
@@ -6631,13 +6759,13 @@
       <w:pPr>
         <w:pStyle w:val="Heading3"/>
       </w:pPr>
-      <w:bookmarkStart w:id="36" w:name="api-endpoints"/>
-      <w:bookmarkStart w:id="37" w:name="_Toc239004809"/>
-      <w:bookmarkEnd w:id="34"/>
+      <w:bookmarkStart w:id="36" w:name="_Toc239004809"/>
+      <w:bookmarkStart w:id="37" w:name="api-endpoints"/>
+      <w:bookmarkEnd w:id="35"/>
       <w:r>
         <w:t>API endpoints</w:t>
       </w:r>
-      <w:bookmarkEnd w:id="37"/>
+      <w:bookmarkEnd w:id="36"/>
     </w:p>
     <w:tbl>
       <w:tblPr>
@@ -6779,11 +6907,7 @@
               <w:pStyle w:val="Compact"/>
             </w:pPr>
             <w:r>
-              <w:t xml:space="preserve">Readiness — 503 until model AND feature pipeline </w:t>
-            </w:r>
-            <w:r>
-              <w:lastRenderedPageBreak/>
-              <w:t>are loaded</w:t>
+              <w:t>Readiness — 503 until model AND feature pipeline are loaded</w:t>
             </w:r>
           </w:p>
         </w:tc>
@@ -6801,7 +6925,6 @@
               <w:rPr>
                 <w:rStyle w:val="VerbatimChar"/>
               </w:rPr>
-              <w:lastRenderedPageBreak/>
               <w:t>/model/info</w:t>
             </w:r>
           </w:p>
@@ -7014,13 +7137,13 @@
       <w:pPr>
         <w:pStyle w:val="Heading3"/>
       </w:pPr>
-      <w:bookmarkStart w:id="38" w:name="sample-test-calls"/>
-      <w:bookmarkStart w:id="39" w:name="_Toc239004810"/>
-      <w:bookmarkEnd w:id="36"/>
+      <w:bookmarkStart w:id="38" w:name="_Toc239004810"/>
+      <w:bookmarkStart w:id="39" w:name="sample-test-calls"/>
+      <w:bookmarkEnd w:id="37"/>
       <w:r>
         <w:t>Sample test calls</w:t>
       </w:r>
-      <w:bookmarkEnd w:id="39"/>
+      <w:bookmarkEnd w:id="38"/>
     </w:p>
     <w:tbl>
       <w:tblPr>
@@ -7249,9 +7372,9 @@
       <w:pPr>
         <w:pStyle w:val="Heading3"/>
       </w:pPr>
-      <w:bookmarkStart w:id="40" w:name="sample-request-post-predict"/>
-      <w:bookmarkStart w:id="41" w:name="_Toc239004811"/>
-      <w:bookmarkEnd w:id="38"/>
+      <w:bookmarkStart w:id="40" w:name="_Toc239004811"/>
+      <w:bookmarkStart w:id="41" w:name="sample-request-post-predict"/>
+      <w:bookmarkEnd w:id="39"/>
       <w:r>
         <w:t xml:space="preserve">Sample request — </w:t>
       </w:r>
@@ -7261,7 +7384,7 @@
         </w:rPr>
         <w:t>POST /predict</w:t>
       </w:r>
-      <w:bookmarkEnd w:id="41"/>
+      <w:bookmarkEnd w:id="40"/>
     </w:p>
     <w:p>
       <w:pPr>
@@ -7319,6 +7442,7 @@
         <w:rPr>
           <w:rStyle w:val="NormalTok"/>
         </w:rPr>
+        <w:lastRenderedPageBreak/>
         <w:t xml:space="preserve">  </w:t>
       </w:r>
       <w:r>
@@ -7788,9 +7912,9 @@
       <w:pPr>
         <w:pStyle w:val="Heading3"/>
       </w:pPr>
-      <w:bookmarkStart w:id="42" w:name="sample-response-post-predict"/>
-      <w:bookmarkStart w:id="43" w:name="_Toc239004812"/>
-      <w:bookmarkEnd w:id="40"/>
+      <w:bookmarkStart w:id="42" w:name="_Toc239004812"/>
+      <w:bookmarkStart w:id="43" w:name="sample-response-post-predict"/>
+      <w:bookmarkEnd w:id="41"/>
       <w:r>
         <w:t xml:space="preserve">Sample response — </w:t>
       </w:r>
@@ -7800,7 +7924,7 @@
         </w:rPr>
         <w:t>POST /predict</w:t>
       </w:r>
-      <w:bookmarkEnd w:id="43"/>
+      <w:bookmarkEnd w:id="42"/>
     </w:p>
     <w:p>
       <w:pPr>
@@ -7858,7 +7982,6 @@
         <w:rPr>
           <w:rStyle w:val="NormalTok"/>
         </w:rPr>
-        <w:lastRenderedPageBreak/>
         <w:t xml:space="preserve">  </w:t>
       </w:r>
       <w:r>
@@ -8133,9 +8256,9 @@
       <w:pPr>
         <w:pStyle w:val="Heading3"/>
       </w:pPr>
-      <w:bookmarkStart w:id="44" w:name="Xebcc4c80c56f9fe7156d315410c1e01f40b05b7"/>
-      <w:bookmarkStart w:id="45" w:name="_Toc239004813"/>
-      <w:bookmarkEnd w:id="42"/>
+      <w:bookmarkStart w:id="44" w:name="_Toc239004813"/>
+      <w:bookmarkStart w:id="45" w:name="Xebcc4c80c56f9fe7156d315410c1e01f40b05b7"/>
+      <w:bookmarkEnd w:id="43"/>
       <w:r>
         <w:t xml:space="preserve">Latency and throughput — </w:t>
       </w:r>
@@ -8145,7 +8268,7 @@
         </w:rPr>
         <w:t>reports/api/latency_report.md</w:t>
       </w:r>
-      <w:bookmarkEnd w:id="45"/>
+      <w:bookmarkEnd w:id="44"/>
     </w:p>
     <w:tbl>
       <w:tblPr>
@@ -8334,13 +8457,13 @@
       <w:pPr>
         <w:pStyle w:val="Heading3"/>
       </w:pPr>
-      <w:bookmarkStart w:id="46" w:name="edge-case-and-validation-handling"/>
-      <w:bookmarkStart w:id="47" w:name="_Toc239004814"/>
-      <w:bookmarkEnd w:id="44"/>
+      <w:bookmarkStart w:id="46" w:name="_Toc239004814"/>
+      <w:bookmarkStart w:id="47" w:name="edge-case-and-validation-handling"/>
+      <w:bookmarkEnd w:id="45"/>
       <w:r>
         <w:t>Edge case and validation handling</w:t>
       </w:r>
-      <w:bookmarkEnd w:id="47"/>
+      <w:bookmarkEnd w:id="46"/>
     </w:p>
     <w:tbl>
       <w:tblPr>
@@ -8566,6 +8689,7 @@
               <w:rPr>
                 <w:rStyle w:val="VerbatimChar"/>
               </w:rPr>
+              <w:lastRenderedPageBreak/>
               <w:t>weather_imputed: true</w:t>
             </w:r>
             <w:r>
@@ -8584,6 +8708,7 @@
               <w:pStyle w:val="Compact"/>
             </w:pPr>
             <w:r>
+              <w:lastRenderedPageBreak/>
               <w:t>Typo’d field name</w:t>
             </w:r>
           </w:p>
@@ -8616,13 +8741,13 @@
       <w:pPr>
         <w:pStyle w:val="Heading3"/>
       </w:pPr>
-      <w:bookmarkStart w:id="48" w:name="key-design-decisions-2"/>
-      <w:bookmarkStart w:id="49" w:name="_Toc239004815"/>
-      <w:bookmarkEnd w:id="46"/>
+      <w:bookmarkStart w:id="48" w:name="_Toc239004815"/>
+      <w:bookmarkStart w:id="49" w:name="key-design-decisions-2"/>
+      <w:bookmarkEnd w:id="47"/>
       <w:r>
         <w:t>Key design decisions</w:t>
       </w:r>
-      <w:bookmarkEnd w:id="49"/>
+      <w:bookmarkEnd w:id="48"/>
     </w:p>
     <w:p>
       <w:pPr>
@@ -8756,26 +8881,25 @@
       <w:pPr>
         <w:pStyle w:val="Heading2"/>
       </w:pPr>
-      <w:bookmarkStart w:id="50" w:name="week-4-m5-monitoring-and-drift"/>
-      <w:bookmarkStart w:id="51" w:name="_Toc239004816"/>
-      <w:bookmarkEnd w:id="32"/>
-      <w:bookmarkEnd w:id="48"/>
-      <w:r>
-        <w:lastRenderedPageBreak/>
+      <w:bookmarkStart w:id="50" w:name="_Toc239004816"/>
+      <w:bookmarkStart w:id="51" w:name="week-4-m5-monitoring-and-drift"/>
+      <w:bookmarkEnd w:id="33"/>
+      <w:bookmarkEnd w:id="49"/>
+      <w:r>
         <w:t>Week 4 / M5 — Monitoring and Drift</w:t>
       </w:r>
-      <w:bookmarkEnd w:id="51"/>
+      <w:bookmarkEnd w:id="50"/>
     </w:p>
     <w:p>
       <w:pPr>
         <w:pStyle w:val="Heading3"/>
       </w:pPr>
-      <w:bookmarkStart w:id="52" w:name="commands-1"/>
-      <w:bookmarkStart w:id="53" w:name="_Toc239004817"/>
+      <w:bookmarkStart w:id="52" w:name="_Toc239004817"/>
+      <w:bookmarkStart w:id="53" w:name="commands-1"/>
       <w:r>
         <w:t>Commands</w:t>
       </w:r>
-      <w:bookmarkEnd w:id="53"/>
+      <w:bookmarkEnd w:id="52"/>
     </w:p>
     <w:p>
       <w:pPr>
@@ -8828,9 +8952,9 @@
       <w:pPr>
         <w:pStyle w:val="Heading3"/>
       </w:pPr>
-      <w:bookmarkStart w:id="54" w:name="X7c0fe040ba77c241392df1ec44bd3d8614c8809"/>
-      <w:bookmarkStart w:id="55" w:name="_Toc239004818"/>
-      <w:bookmarkEnd w:id="52"/>
+      <w:bookmarkStart w:id="54" w:name="_Toc239004818"/>
+      <w:bookmarkStart w:id="55" w:name="X7c0fe040ba77c241392df1ec44bd3d8614c8809"/>
+      <w:bookmarkEnd w:id="53"/>
       <w:r>
         <w:t xml:space="preserve">Drift simulation — </w:t>
       </w:r>
@@ -8840,7 +8964,7 @@
         </w:rPr>
         <w:t>reports/monitoring/drift_report.md</w:t>
       </w:r>
-      <w:bookmarkEnd w:id="55"/>
+      <w:bookmarkEnd w:id="54"/>
     </w:p>
     <w:p>
       <w:pPr>
@@ -9518,6 +9642,7 @@
               <w:rPr>
                 <w:rStyle w:val="VerbatimChar"/>
               </w:rPr>
+              <w:lastRenderedPageBreak/>
               <w:t>temperature_c</w:t>
             </w:r>
           </w:p>
@@ -9738,9 +9863,9 @@
       <w:pPr>
         <w:pStyle w:val="Heading3"/>
       </w:pPr>
-      <w:bookmarkStart w:id="56" w:name="X561842a72583c3c8ee2a66a3b7f4a78ee8b5e36"/>
-      <w:bookmarkStart w:id="57" w:name="_Toc239004819"/>
-      <w:bookmarkEnd w:id="54"/>
+      <w:bookmarkStart w:id="56" w:name="_Toc239004819"/>
+      <w:bookmarkStart w:id="57" w:name="X561842a72583c3c8ee2a66a3b7f4a78ee8b5e36"/>
+      <w:bookmarkEnd w:id="55"/>
       <w:r>
         <w:t xml:space="preserve">Retraining decision — </w:t>
       </w:r>
@@ -9750,7 +9875,7 @@
         </w:rPr>
         <w:t>reports/monitoring/retraining_decision.md</w:t>
       </w:r>
-      <w:bookmarkEnd w:id="57"/>
+      <w:bookmarkEnd w:id="56"/>
     </w:p>
     <w:tbl>
       <w:tblPr>
@@ -9942,7 +10067,6 @@
           <w:b/>
           <w:bCs/>
         </w:rPr>
-        <w:lastRenderedPageBreak/>
         <w:t>Decision: 🔴 RETRAIN</w:t>
       </w:r>
       <w:r>
@@ -10009,13 +10133,13 @@
       <w:pPr>
         <w:pStyle w:val="Heading3"/>
       </w:pPr>
-      <w:bookmarkStart w:id="58" w:name="monitoring-infrastructure"/>
-      <w:bookmarkStart w:id="59" w:name="_Toc239004820"/>
-      <w:bookmarkEnd w:id="56"/>
+      <w:bookmarkStart w:id="58" w:name="_Toc239004820"/>
+      <w:bookmarkStart w:id="59" w:name="monitoring-infrastructure"/>
+      <w:bookmarkEnd w:id="57"/>
       <w:r>
         <w:t>Monitoring infrastructure</w:t>
       </w:r>
-      <w:bookmarkEnd w:id="59"/>
+      <w:bookmarkEnd w:id="58"/>
     </w:p>
     <w:p>
       <w:pPr>
@@ -10139,13 +10263,13 @@
       <w:pPr>
         <w:pStyle w:val="Heading3"/>
       </w:pPr>
-      <w:bookmarkStart w:id="60" w:name="key-design-decisions-3"/>
-      <w:bookmarkStart w:id="61" w:name="_Toc239004821"/>
-      <w:bookmarkEnd w:id="58"/>
+      <w:bookmarkStart w:id="60" w:name="_Toc239004821"/>
+      <w:bookmarkStart w:id="61" w:name="key-design-decisions-3"/>
+      <w:bookmarkEnd w:id="59"/>
       <w:r>
         <w:t>Key design decisions</w:t>
       </w:r>
-      <w:bookmarkEnd w:id="61"/>
+      <w:bookmarkEnd w:id="60"/>
     </w:p>
     <w:p>
       <w:pPr>
@@ -10226,6 +10350,7 @@
           <w:b/>
           <w:bCs/>
         </w:rPr>
+        <w:lastRenderedPageBreak/>
         <w:t xml:space="preserve">Live error signal abstains below </w:t>
       </w:r>
       <w:r>
@@ -10258,25 +10383,25 @@
       <w:pPr>
         <w:pStyle w:val="Heading2"/>
       </w:pPr>
-      <w:bookmarkStart w:id="62" w:name="design-decision-justification"/>
-      <w:bookmarkStart w:id="63" w:name="_Toc239004822"/>
-      <w:bookmarkEnd w:id="50"/>
-      <w:bookmarkEnd w:id="60"/>
+      <w:bookmarkStart w:id="62" w:name="_Toc239004822"/>
+      <w:bookmarkStart w:id="63" w:name="design-decision-justification"/>
+      <w:bookmarkEnd w:id="51"/>
+      <w:bookmarkEnd w:id="61"/>
       <w:r>
         <w:t>Design Decision Justification</w:t>
       </w:r>
-      <w:bookmarkEnd w:id="63"/>
+      <w:bookmarkEnd w:id="62"/>
     </w:p>
     <w:p>
       <w:pPr>
         <w:pStyle w:val="Heading3"/>
       </w:pPr>
-      <w:bookmarkStart w:id="64" w:name="model-choice"/>
-      <w:bookmarkStart w:id="65" w:name="_Toc239004823"/>
+      <w:bookmarkStart w:id="64" w:name="_Toc239004823"/>
+      <w:bookmarkStart w:id="65" w:name="model-choice"/>
       <w:r>
         <w:t>Model choice</w:t>
       </w:r>
-      <w:bookmarkEnd w:id="65"/>
+      <w:bookmarkEnd w:id="64"/>
     </w:p>
     <w:tbl>
       <w:tblPr>
@@ -10409,11 +10534,7 @@
               <w:t>log1p(duration)</w:t>
             </w:r>
             <w:r>
-              <w:t xml:space="preserve"> reduces the long-trip error </w:t>
-            </w:r>
-            <w:r>
-              <w:lastRenderedPageBreak/>
-              <w:t>tail without changing the serving contract.</w:t>
+              <w:t xml:space="preserve"> reduces the long-trip error tail without changing the serving contract.</w:t>
             </w:r>
           </w:p>
         </w:tc>
@@ -10423,14 +10544,13 @@
       <w:pPr>
         <w:pStyle w:val="Heading3"/>
       </w:pPr>
-      <w:bookmarkStart w:id="66" w:name="drift-detection-approach"/>
-      <w:bookmarkStart w:id="67" w:name="_Toc239004824"/>
-      <w:bookmarkEnd w:id="64"/>
-      <w:r>
-        <w:lastRenderedPageBreak/>
+      <w:bookmarkStart w:id="66" w:name="_Toc239004824"/>
+      <w:bookmarkStart w:id="67" w:name="drift-detection-approach"/>
+      <w:bookmarkEnd w:id="65"/>
+      <w:r>
         <w:t>Drift-detection approach</w:t>
       </w:r>
-      <w:bookmarkEnd w:id="67"/>
+      <w:bookmarkEnd w:id="66"/>
     </w:p>
     <w:tbl>
       <w:tblPr>
@@ -10573,13 +10693,13 @@
       <w:pPr>
         <w:pStyle w:val="Heading3"/>
       </w:pPr>
-      <w:bookmarkStart w:id="68" w:name="retraining-trigger"/>
-      <w:bookmarkStart w:id="69" w:name="_Toc239004825"/>
-      <w:bookmarkEnd w:id="66"/>
+      <w:bookmarkStart w:id="68" w:name="_Toc239004825"/>
+      <w:bookmarkStart w:id="69" w:name="retraining-trigger"/>
+      <w:bookmarkEnd w:id="67"/>
       <w:r>
         <w:t>Retraining trigger</w:t>
       </w:r>
-      <w:bookmarkEnd w:id="69"/>
+      <w:bookmarkEnd w:id="68"/>
     </w:p>
     <w:tbl>
       <w:tblPr>
@@ -10699,6 +10819,7 @@
               <w:pStyle w:val="Compact"/>
             </w:pPr>
             <w:r>
+              <w:lastRenderedPageBreak/>
               <w:t xml:space="preserve">Thresholds stored in </w:t>
             </w:r>
             <w:r>
@@ -10735,14 +10856,14 @@
       <w:pPr>
         <w:pStyle w:val="Heading2"/>
       </w:pPr>
-      <w:bookmarkStart w:id="70" w:name="test-coverage"/>
-      <w:bookmarkStart w:id="71" w:name="_Toc239004826"/>
-      <w:bookmarkEnd w:id="62"/>
-      <w:bookmarkEnd w:id="68"/>
+      <w:bookmarkStart w:id="70" w:name="_Toc239004826"/>
+      <w:bookmarkStart w:id="71" w:name="test-coverage"/>
+      <w:bookmarkEnd w:id="63"/>
+      <w:bookmarkEnd w:id="69"/>
       <w:r>
         <w:t>Test Coverage</w:t>
       </w:r>
-      <w:bookmarkEnd w:id="71"/>
+      <w:bookmarkEnd w:id="70"/>
     </w:p>
     <w:tbl>
       <w:tblPr>
@@ -10946,14 +11067,7 @@
               <w:rPr>
                 <w:rStyle w:val="VerbatimChar"/>
               </w:rPr>
-              <w:t>tests/test_model_trainin</w:t>
-            </w:r>
-            <w:r>
-              <w:rPr>
-                <w:rStyle w:val="VerbatimChar"/>
-              </w:rPr>
-              <w:lastRenderedPageBreak/>
-              <w:t>g.py</w:t>
+              <w:t>tests/test_model_training.py</w:t>
             </w:r>
           </w:p>
         </w:tc>
@@ -10966,12 +11080,7 @@
               <w:pStyle w:val="Compact"/>
             </w:pPr>
             <w:r>
-              <w:lastRenderedPageBreak/>
-              <w:t xml:space="preserve">Metric calculation, </w:t>
-            </w:r>
-            <w:r>
-              <w:lastRenderedPageBreak/>
-              <w:t>estimator structure, selection discipline</w:t>
+              <w:t>Metric calculation, estimator structure, selection discipline</w:t>
             </w:r>
           </w:p>
         </w:tc>
@@ -10984,7 +11093,6 @@
               <w:pStyle w:val="Compact"/>
             </w:pPr>
             <w:r>
-              <w:lastRenderedPageBreak/>
               <w:t>✅ Pass</w:t>
             </w:r>
           </w:p>
@@ -11420,13 +11528,14 @@
       <w:pPr>
         <w:pStyle w:val="Heading2"/>
       </w:pPr>
-      <w:bookmarkStart w:id="72" w:name="reproduce-everything"/>
-      <w:bookmarkStart w:id="73" w:name="_Toc239004827"/>
-      <w:bookmarkEnd w:id="70"/>
-      <w:r>
+      <w:bookmarkStart w:id="72" w:name="_Toc239004827"/>
+      <w:bookmarkStart w:id="73" w:name="reproduce-everything"/>
+      <w:bookmarkEnd w:id="71"/>
+      <w:r>
+        <w:lastRenderedPageBreak/>
         <w:t>Reproduce Everything</w:t>
       </w:r>
-      <w:bookmarkEnd w:id="73"/>
+      <w:bookmarkEnd w:id="72"/>
     </w:p>
     <w:p>
       <w:pPr>
@@ -11760,7 +11869,6 @@
         <w:rPr>
           <w:rStyle w:val="CommentTok"/>
         </w:rPr>
-        <w:lastRenderedPageBreak/>
         <w:t># 6. Run monitoring</w:t>
       </w:r>
       <w:r>
@@ -11830,7 +11938,7 @@
         <w:t>db</w:t>
       </w:r>
       <w:bookmarkEnd w:id="0"/>
-      <w:bookmarkEnd w:id="72"/>
+      <w:bookmarkEnd w:id="73"/>
     </w:p>
     <w:sectPr>
       <w:footnotePr>

</xml_diff>